<commit_message>
Rewrite section 7 around domestic–red junglefowl–feral gene flow in concise review style (v10)
</commit_message>
<xml_diff>
--- a/v10_sec7_clean.docx
+++ b/v10_sec7_clean.docx
@@ -570,7 +570,7 @@
         <w:t>[12]</w:t>
       </w:r>
       <w:r>
-        <w:t>。历史标本与现生资料得到相近的亲缘结果，为Wang等的主要祖源判断增加了支持。该研究比较的是近现代输入的增加，未量化历史标本中已有的家鸡贡献；现代红原鸡的混合变化详见第7.3节。</w:t>
+        <w:t>。历史标本与现生资料得到相近的亲缘结果，为Wang等的主要祖源判断增加了支持。该研究比较的是近现代输入的增加，未量化历史标本中已有的家鸡贡献；现代红原鸡的混合变化详见第7.2节。</w:t>
       </w:r>
     </w:p>
     <w:p>
@@ -4315,7 +4315,7 @@
         <w:jc w:val="left"/>
       </w:pPr>
       <w:r>
-        <w:t>7 传播后的来源叠加与持续基因流</w:t>
+        <w:t>7 家鸡、红原鸡与野化群体之间的基因流</w:t>
       </w:r>
     </w:p>
     <w:p>
@@ -4323,7 +4323,7 @@
         <w:jc w:val="both"/>
       </w:pPr>
       <w:r>
-        <w:t>第5节以可靠的最早记录界定鸡进入各地的时间。鸡在某地出现以后，新的种源仍经引种进入，育种又把不同来源重新组合，家鸡与红原鸡之间的基因流也在继续，现代鸡群因而是不同时期来源叠加的结果。本节以“引种”指人为把鸡群带入新地区，“基因流”指群体间的遗传交换，“渗入”指外来片段经杂交进入并保留在受体基因组中，“混合”指群体层面的祖源组成；“商业系”指跨国育种公司培育的肉鸡、蛋鸡品系及其配套杂交系，本地育成的杂交商品系另行注明。</w:t>
+        <w:t>驯化以后，家鸡与红原鸡在同域分布区内仍发生双向基因流，逸出的家鸡还可形成野化群体，并再与红原鸡混合（其他原鸡物种及红原鸡各亚种对家鸡祖源的贡献见第3.2节和第3.3节）。</w:t>
       </w:r>
     </w:p>
     <w:p>
@@ -4332,7 +4332,7 @@
         <w:jc w:val="left"/>
       </w:pPr>
       <w:r>
-        <w:t>7.1 多次引种与现代鸡群的来源层次</w:t>
+        <w:t>7.1 红原鸡向家鸡的基因流</w:t>
       </w:r>
     </w:p>
     <w:p>
@@ -4340,7 +4340,7 @@
         <w:jc w:val="both"/>
       </w:pPr>
       <w:r>
-        <w:t>东非和西亚的现代鸡群可以用来检验第5.1节的路线推断。Mwacharo等（2011）分析肯尼亚、埃塞俄比亚、苏丹和乌干达512只村鸡的线粒体控制区，识别出至少5个母系类群：最常见者可能来自印度次大陆，次常见者可能经海路来自东南亚或东亚，两个少见类群可能来自近期商业系的渗入</w:t>
+        <w:t>在红原鸡与放养家鸡同域分布的越南河江，微卫星分析显示，部分乡的地方鸡与红原鸡聚为一类并呈混合模式，提示存在由红原鸡流向家鸡的基因流</w:t>
       </w:r>
       <w:r>
         <w:rPr>
@@ -4349,7 +4349,7 @@
         <w:t>[112]</w:t>
       </w:r>
       <w:r>
-        <w:t>。Mwacharo等（2013）用30个常染色体微卫星分析同一地区的657只村鸡，发现基因库I主要见于埃塞俄比亚和苏丹，基因库II、III见于肯尼亚和乌干达，二者比例由肯尼亚沿海向乌干达内陆渐变；在允许混合的模型下，基因库II的267只中只有4只、基因库III的191只中只有6只对商业簇的隶属系数超过0.2</w:t>
+        <w:t>。同一群体的线粒体资料未见相应的地理信号，表明这一基因流可能主要经野生公鸡与家养母鸡交配发生，而非来自采拾野卵</w:t>
       </w:r>
       <w:r>
         <w:rPr>
@@ -4358,87 +4358,159 @@
         <w:t>[113]</w:t>
       </w:r>
       <w:r>
-        <w:t>。作者把三个基因库解释为鸡和人群进入该地区的不同事件，并与陆路和海路接触相联系</w:t>
+        <w:t>。在泰国，Lao Pa Koi斗鸡和Mae Hong Son鸡均含部分红原鸡基因库成分</w:t>
       </w:r>
       <w:r>
         <w:rPr>
           <w:vertAlign w:val="superscript"/>
         </w:rPr>
-        <w:t>[113]</w:t>
-      </w:r>
-      <w:r>
-        <w:t>。Al-Jumaili等（2020）按Liu等的分支体系</w:t>
+        <w:t>[114,115]</w:t>
+      </w:r>
+      <w:r>
+        <w:t>；而Lueng Hang Khao和Pradu Hang Dam等斗鸡品种主要与其他家鸡品种混合，受红原鸡的影响很小</w:t>
       </w:r>
       <w:r>
         <w:rPr>
           <w:vertAlign w:val="superscript"/>
         </w:rPr>
-        <w:t>[1]</w:t>
-      </w:r>
-      <w:r>
-        <w:t>分析中东、北非、非洲之角和巴基斯坦的706只鸡，E分支占625只，作者认为它可能经陆路来自印度次大陆；D分支见于除阿尔及利亚和利比亚外的各国，被视为印度洋海上贸易网络的遗留；母系变异缺少明显的地理信号，作者认为古代和较近的贸易网络共同塑造了现今的组成</w:t>
+        <w:t>[116]</w:t>
+      </w:r>
+      <w:r>
+        <w:t>。全基因组资料可将这类基因流定位到具体区段：D统计量提示东南亚斗鸡与</w:t>
+      </w:r>
+      <w:r>
+        <w:rPr>
+          <w:i/>
+        </w:rPr>
+        <w:t>G. g. gallus</w:t>
+      </w:r>
+      <w:r>
+        <w:t>之间存在基因流；在</w:t>
+      </w:r>
+      <w:r>
+        <w:rPr>
+          <w:i/>
+        </w:rPr>
+        <w:t>CPZ</w:t>
+      </w:r>
+      <w:r>
+        <w:t>区段，东南亚、吐鲁番、西双版纳和日本的斗鸡样本均与</w:t>
+      </w:r>
+      <w:r>
+        <w:rPr>
+          <w:i/>
+        </w:rPr>
+        <w:t>G. g. gallus</w:t>
+      </w:r>
+      <w:r>
+        <w:t>聚在一起</w:t>
       </w:r>
       <w:r>
         <w:rPr>
           <w:vertAlign w:val="superscript"/>
         </w:rPr>
-        <w:t>[114]</w:t>
-      </w:r>
-      <w:r>
-        <w:t>。这些结果与第5.1节“早期陆地和红海联系、较晚海上输入”的推断相容，但都来自现代样本，少见类群还可能来自近期商业系，不能据此为各来源定年。</w:t>
+        <w:t>[117]</w:t>
+      </w:r>
+      <w:r>
+        <w:t>，表明红原鸡来源的片段可在特定品种中保留下来。</w:t>
       </w:r>
     </w:p>
     <w:p>
       <w:pPr>
-        <w:jc w:val="both"/>
-      </w:pPr>
-      <w:r>
-        <w:t>南美的情况与此相似。Herrera等（2020）发现，南美大陆现代鸡的母系约84%属E分支，A、B、C分支都很少，岛屿东南亚和太平洋常见的D分支未检出，作者认为大陆鸡与欧洲、亚洲鸡更接近</w:t>
-      </w:r>
-      <w:r>
-        <w:rPr>
-          <w:vertAlign w:val="superscript"/>
-        </w:rPr>
-        <w:t>[115]</w:t>
-      </w:r>
-      <w:r>
-        <w:t>。Luzuriaga-Neira等（2019）的基因组资料显示，除智利外，各国地方鸡的平均商业蛋鸡成分为44%～79%，肉鸡成分为16%～32%；斗鸡成分为4%～27%，智利最低，哥伦比亚最高</w:t>
-      </w:r>
-      <w:r>
-        <w:rPr>
-          <w:vertAlign w:val="superscript"/>
-        </w:rPr>
-        <w:t>[116]</w:t>
-      </w:r>
-      <w:r>
-        <w:t>。智利和复活节岛群体含较高比例的未知来源成分，复活节岛的这一成分也见于南美太平洋沿岸的地方鸡，作者认为这可能反映沿岸鸡群对复活节岛的影响</w:t>
-      </w:r>
-      <w:r>
-        <w:rPr>
-          <w:vertAlign w:val="superscript"/>
-        </w:rPr>
-        <w:t>[116]</w:t>
-      </w:r>
-      <w:r>
-        <w:t>。这些现代样本不能判定跨太平洋接触的有无、年代和方向（见第5.3节），却表明商业系已成为多数受检国家地方鸡的主要组分，现代相近并不等于古代来源。来源的先后需要时间序列来确定。Olli等（2026）测定201 bp控制区，波罗的海古鸡除奥兰群岛1只属B分支外均属E1；现代芬兰地方鸡中的A分支不见于公元3～18世纪的古代样本，作者据此推断其为后来渗入</w:t>
-      </w:r>
-      <w:r>
-        <w:rPr>
-          <w:vertAlign w:val="superscript"/>
-        </w:rPr>
-        <w:t>[90]</w:t>
-      </w:r>
-      <w:r>
-        <w:t>。现代群体能显示多种来源，先后次序则要依靠古代样本、文献记录或混合时间估计确定。</w:t>
+        <w:pStyle w:val="Heading2"/>
+        <w:jc w:val="left"/>
+      </w:pPr>
+      <w:r>
+        <w:t>7.2 家鸡向红原鸡的基因流</w:t>
       </w:r>
     </w:p>
     <w:p>
       <w:pPr>
+        <w:jc w:val="both"/>
+      </w:pPr>
+      <w:r>
+        <w:t>反方向的基因流同样存在。在印度，微卫星和线粒体D-loop分析提示存在由家鸡流向自由活动红原鸡的定向基因流</w:t>
+      </w:r>
+      <w:r>
+        <w:rPr>
+          <w:vertAlign w:val="superscript"/>
+        </w:rPr>
+        <w:t>[118]</w:t>
+      </w:r>
+      <w:r>
+        <w:t>，而早期研究认为两者在野外极少杂交</w:t>
+      </w:r>
+      <w:r>
+        <w:rPr>
+          <w:vertAlign w:val="superscript"/>
+        </w:rPr>
+        <w:t>[21]</w:t>
+      </w:r>
+      <w:r>
+        <w:t>。以1874～1939年采集的博物馆标本为野生参照，多数现代</w:t>
+      </w:r>
+      <w:r>
+        <w:rPr>
+          <w:i/>
+        </w:rPr>
+        <w:t>spadiceus</w:t>
+      </w:r>
+      <w:r>
+        <w:t>个体有20%～50%的祖源来自家鸡；局部祖源分析中，清迈、曼尼普尔和云南个体的家鸡来源等位基因占83%～96%，只以商业品种为家鸡参照时则降至30%～70%</w:t>
+      </w:r>
+      <w:r>
+        <w:rPr>
+          <w:vertAlign w:val="superscript"/>
+        </w:rPr>
+        <w:t>[12]</w:t>
+      </w:r>
+      <w:r>
+        <w:t>，表明渗入的估计值对参照的选择十分敏感。在新加坡，自由活动的红原鸡呈现从野化到野生的连续梯度，各亚群的渗入程度不同</w:t>
+      </w:r>
+      <w:r>
+        <w:rPr>
+          <w:vertAlign w:val="superscript"/>
+        </w:rPr>
+        <w:t>[119]</w:t>
+      </w:r>
+      <w:r>
+        <w:t>。外形也难以可靠地反映祖源。基于博物馆标本，雄鸟蚀羽曾被视为纯野生基因型的标志，多数野生群体被推测已受家鸡渗入</w:t>
+      </w:r>
+      <w:r>
+        <w:rPr>
+          <w:vertAlign w:val="superscript"/>
+        </w:rPr>
+        <w:t>[120]</w:t>
+      </w:r>
+      <w:r>
+        <w:t>；而已知纯度的回交系显示，母鸡冠退化、雄鸟蚀羽等常用纯度指标在含家鸡成分的后代中同样会出现</w:t>
+      </w:r>
+      <w:r>
+        <w:rPr>
+          <w:vertAlign w:val="superscript"/>
+        </w:rPr>
+        <w:t>[121]</w:t>
+      </w:r>
+      <w:r>
+        <w:t>。此外，新加坡红原鸡的外形评分与基因组估计的家养程度显著相关，外形分值75被提出作为识别野生型个体的阈值</w:t>
+      </w:r>
+      <w:r>
+        <w:rPr>
+          <w:vertAlign w:val="superscript"/>
+        </w:rPr>
+        <w:t>[119]</w:t>
+      </w:r>
+      <w:r>
+        <w:t>，表明外形可用于初筛，但不能替代基因组检验。</w:t>
+      </w:r>
+    </w:p>
+    <w:p>
+      <w:pPr>
         <w:pStyle w:val="Heading2"/>
         <w:jc w:val="left"/>
       </w:pPr>
       <w:r>
-        <w:t>7.2 品种形成与商业种源的扩散</w:t>
+        <w:t>7.3 野化群体的来源与选择</w:t>
       </w:r>
     </w:p>
     <w:p>
@@ -4446,87 +4518,52 @@
         <w:jc w:val="both"/>
       </w:pPr>
       <w:r>
-        <w:t>品种本身也是多来源重组的产物。Guo等（2019）以弗吉尼亚白洛克体重选择系为对象，与8个候选创始种源共150只鸡比较，发现Dominique、两个Cochin种群和Black Java合计贡献约89%的常染色体组成，Brahma、Langshan和Black Minorca的贡献各不足10%，各来源在不同染色体上的比例差异明显</w:t>
+        <w:t>夏威夷Kauai岛的野化鸡含两支线粒体谱系：少见的一支与欧洲人到来前的Kauai古DNA同属，可能由古代波利尼西亚人带入；常见的一支见于世界各地，包括近代欧洲育成的品种</w:t>
       </w:r>
       <w:r>
         <w:rPr>
           <w:vertAlign w:val="superscript"/>
         </w:rPr>
-        <w:t>[117]</w:t>
-      </w:r>
-      <w:r>
-        <w:t>。Guo等（2022）比较43个群体的636份基因组，发现东西方肉用鸡的基因组都以亚洲重型品种的贡献为主</w:t>
+        <w:t>[122]</w:t>
+      </w:r>
+      <w:r>
+        <w:t>。这提示现今群体源于近代家鸡对古老种群的侵入。岛上在1939年曾放归857只红原鸡；基因组分析检出红原鸡和白来航蛋鸡的贡献，混合时间估计为1981年（1976～1995年），与1982年和1992年飓风后家鸡大量逸出相符</w:t>
       </w:r>
       <w:r>
         <w:rPr>
           <w:vertAlign w:val="superscript"/>
         </w:rPr>
-        <w:t>[118]</w:t>
-      </w:r>
-      <w:r>
-        <w:t>。荷兰传统品种中，Drenthe Fowl矮脚变种在</w:t>
-      </w:r>
-      <w:r>
-        <w:rPr>
-          <w:i/>
-        </w:rPr>
-        <w:t>HMGA2</w:t>
-      </w:r>
-      <w:r>
-        <w:t>附近与供体Dutch Bantam几乎完全共享单倍型，其他区段也保留了较长的供体片段</w:t>
+        <w:t>[123]</w:t>
+      </w:r>
+      <w:r>
+        <w:t>。Kauai野化鸡的选择扫描区大多为野化特有，不同于驯化中受选择的区域</w:t>
       </w:r>
       <w:r>
         <w:rPr>
           <w:vertAlign w:val="superscript"/>
         </w:rPr>
-        <w:t>[96]</w:t>
-      </w:r>
-      <w:r>
-        <w:t>。斗鸡同样不是封闭群体，混合检验和迁移模型提示，斗鸡与Rhode Island Red、伊朗地方鸡等群体之间存在基因流</w:t>
+        <w:t>[124]</w:t>
+      </w:r>
+      <w:r>
+        <w:t>。与之相比，独立形成的百慕大野化群体较多含褐壳蛋鸡和肉鸡背景，Kauai群体则较多含白壳蛋鸡和红原鸡成分；两地共同的选择扫描区中，单倍型主要为家养来源</w:t>
       </w:r>
       <w:r>
         <w:rPr>
           <w:vertAlign w:val="superscript"/>
         </w:rPr>
-        <w:t>[119]</w:t>
-      </w:r>
-      <w:r>
-        <w:t>。</w:t>
+        <w:t>[125]</w:t>
+      </w:r>
+      <w:r>
+        <w:t>，表明家鸡来源的变异可在野外保留，并成为野化后选择的材料。</w:t>
       </w:r>
     </w:p>
     <w:p>
       <w:pPr>
-        <w:jc w:val="both"/>
-      </w:pPr>
-      <w:r>
-        <w:t>选育也可以在这样的多来源基础群中分拣已有变异。在同一批弗吉尼亚选择系中，</w:t>
-      </w:r>
-      <w:r>
-        <w:rPr>
-          <w:i/>
-        </w:rPr>
-        <w:t>IGF2BP1</w:t>
-      </w:r>
-      <w:r>
-        <w:t>启动子区3.2 kb缺失在高体重系中固定，低体重系则固定为野生型；野生型在地方品种和野生近缘种中占优，缺失型主要见于商业肉鸡和除白来航外的多数商业蛋鸡</w:t>
-      </w:r>
-      <w:r>
-        <w:rPr>
-          <w:vertAlign w:val="superscript"/>
-        </w:rPr>
-        <w:t>[104]</w:t>
-      </w:r>
-      <w:r>
-        <w:t>（其效应见第6.3节）。Muir等（2008）发现，祖先品种50%以上的遗传多样性在商业纯系中缺失，合并同一公司的品系也不能恢复稀有的祖先等位基因</w:t>
-      </w:r>
-      <w:r>
-        <w:rPr>
-          <w:vertAlign w:val="superscript"/>
-        </w:rPr>
-        <w:t>[120]</w:t>
-      </w:r>
-      <w:r>
-        <w:t>。以商业系代表家鸡时，应注意它们是近代育种形成、来源多元而变异已经收窄的一部分家鸡。</w:t>
+        <w:pStyle w:val="Heading2"/>
+        <w:jc w:val="left"/>
+      </w:pPr>
+      <w:r>
+        <w:t>7.4 对野生参照与红原鸡保护的含义</w:t>
       </w:r>
     </w:p>
     <w:p>
@@ -4534,1187 +4571,88 @@
         <w:jc w:val="both"/>
       </w:pPr>
       <w:r>
-        <w:t>商业种源又经推广进入地方鸡。Zhang等（2019）用60K芯片分析1187只鸡，以茶花鸡为祖先参照、按单倍型相似度判定渗入区段，估计受检中国地方鸡平均约15%的基因组来自商业肉鸡，从藏鸡的0.64%到惠阳胡须鸡的21.52%不等</w:t>
+        <w:t>这些基因流直接影响以红原鸡为野生参照的研究。以历史标本为参照检出的驯化候选基因中，可评估的6个有5个在多数现代红原鸡中带有家鸡来源的拷贝；若以现代个体为参照，这些基因将无法被检出</w:t>
       </w:r>
       <w:r>
         <w:rPr>
           <w:vertAlign w:val="superscript"/>
         </w:rPr>
-        <w:t>[10]</w:t>
-      </w:r>
-      <w:r>
-        <w:t>。商业肉鸡本身含亚洲品种成分，这类估计因而依赖祖先参照的选择。Chen等（2019）发现，江西七个地方品种中有四个带有与欧洲商业品种混合的信号，另三个代表当地的祖先谱系，与前四者分化</w:t>
+        <w:t>[12]</w:t>
+      </w:r>
+      <w:r>
+        <w:t>。此外，不少研究所用的红原鸡来自圈养群体。例如，第4.3节的温顺选择线起始于两个圈养种群</w:t>
       </w:r>
       <w:r>
         <w:rPr>
           <w:vertAlign w:val="superscript"/>
         </w:rPr>
-        <w:t>[121]</w:t>
-      </w:r>
-      <w:r>
-        <w:t>。Qi等（2024）用37,698个SNP分析华南10个群体的321只鸡，其中小白鸡为外来杂交系，黄麻鸡为本地育成的杂交商品系</w:t>
+        <w:t>[56]</w:t>
+      </w:r>
+      <w:r>
+        <w:t>，Kauai混合分析中的红原鸡供体也来自动物园</w:t>
       </w:r>
       <w:r>
         <w:rPr>
           <w:vertAlign w:val="superscript"/>
         </w:rPr>
-        <w:t>[122]</w:t>
-      </w:r>
-      <w:r>
-        <w:t>。TreeMix推断小白鸡向阳山鸡和惠阳胡须鸡输入，并给出“沙栏鸡→黄麻鸡”一边</w:t>
+        <w:t>[123]</w:t>
+      </w:r>
+      <w:r>
+        <w:t>。日本动物园的红原鸡经历了严重瓶颈，纯合片段极长，并有可能的家鸡混合迹象</w:t>
       </w:r>
       <w:r>
         <w:rPr>
           <w:vertAlign w:val="superscript"/>
         </w:rPr>
-        <w:t>[122]</w:t>
-      </w:r>
-      <w:r>
-        <w:t>；后者也可能只反映黄麻鸡育成时使用的地方来源，且沙栏鸡和黄麻鸡分别只有19只和13只，不足以说明育成后的反向基因流。</w:t>
-      </w:r>
-    </w:p>
-    <w:p>
-      <w:pPr>
-        <w:jc w:val="both"/>
-      </w:pPr>
-      <w:r>
-        <w:t>渗入程度取决于实际的推广和配种。Leroy等（2012）在五国472只村鸡中，于摩洛哥和喀麦隆检出商业相关基因流，在贝宁、加纳和科特迪瓦未检出，作者将差异与分发杂交雏鸡等改良计划的历史联系起来</w:t>
+        <w:t>[126]</w:t>
+      </w:r>
+      <w:r>
+        <w:t>；而强烈的漂变本身也可使群体结构分析得到类似混合的结果</w:t>
       </w:r>
       <w:r>
         <w:rPr>
           <w:vertAlign w:val="superscript"/>
         </w:rPr>
-        <w:t>[11]</w:t>
-      </w:r>
-      <w:r>
-        <w:t>。阿尔及利亚西部233只村鸡也显示与商业系之间的基因流，作者推测源于未记录的杂交</w:t>
+        <w:t>[127]</w:t>
+      </w:r>
+      <w:r>
+        <w:t>。在保护方面，现代</w:t>
+      </w:r>
+      <w:r>
+        <w:rPr>
+          <w:i/>
+        </w:rPr>
+        <w:t>spadiceus</w:t>
+      </w:r>
+      <w:r>
+        <w:t>的观察杂合度约为历史样本的十分之一，这被归因于高度同质的家鸡等位基因的渗入</w:t>
       </w:r>
       <w:r>
         <w:rPr>
           <w:vertAlign w:val="superscript"/>
         </w:rPr>
-        <w:t>[123]</w:t>
-      </w:r>
-      <w:r>
-        <w:t>。卢旺达Rwamagana地方鸡与SASSO遗传上相近，作者认为这反映了无控制的杂交</w:t>
+        <w:t>[12]</w:t>
+      </w:r>
+      <w:r>
+        <w:t>。新加坡已建议移除外形分值低于75的个体，以维持野生基因型</w:t>
       </w:r>
       <w:r>
         <w:rPr>
           <w:vertAlign w:val="superscript"/>
         </w:rPr>
-        <w:t>[124]</w:t>
-      </w:r>
-      <w:r>
-        <w:t>；土耳其Denizli和Gerze则总体与商业肉鸡、蛋鸡杂交系分开，仅2只Gerze个体与之重叠</w:t>
+        <w:t>[119]</w:t>
+      </w:r>
+      <w:r>
+        <w:t>。另一项研究以164只红原鸡和1796只家鸡的基因组训练深度学习模型，得到285个SNP的判别面板；该面板将45份历史标本中的44份判为红原鸡，而云南查没的24份疑似红原鸡中只有12份被判为红原鸡</w:t>
       </w:r>
       <w:r>
         <w:rPr>
           <w:vertAlign w:val="superscript"/>
         </w:rPr>
-        <w:t>[125]</w:t>
-      </w:r>
-      <w:r>
-        <w:t>。同一推广背景下，渗入程度因地区、品种和配种实践而异，不能只凭地理相邻推断。</w:t>
-      </w:r>
-    </w:p>
-    <w:p>
-      <w:pPr>
-        <w:pStyle w:val="Heading2"/>
-        <w:jc w:val="left"/>
-      </w:pPr>
-      <w:r>
-        <w:t>7.3 家鸡、红原鸡与野化群体之间的基因流</w:t>
-      </w:r>
-    </w:p>
-    <w:p>
-      <w:pPr>
-        <w:jc w:val="both"/>
-      </w:pPr>
-      <w:r>
-        <w:t>基因流也发生在家鸡与红原鸡之间。越南河江的核遗传分析支持红原鸡向部分地方鸡的基因流，母系比较却未见相应的地理信号；结合当地情况，作者认为野生公鸡与家养母鸡交配可能比采拾野卵更常见</w:t>
-      </w:r>
-      <w:r>
-        <w:rPr>
-          <w:vertAlign w:val="superscript"/>
-        </w:rPr>
-        <w:t>[126,127]</w:t>
-      </w:r>
-      <w:r>
-        <w:t>。泰国Lao Pa Koi斗鸡的28个微卫星和线粒体资料也显示了红原鸡与地方鸡的混合</w:t>
-      </w:r>
-      <w:r>
-        <w:rPr>
-          <w:vertAlign w:val="superscript"/>
-        </w:rPr>
         <w:t>[128]</w:t>
       </w:r>
       <w:r>
-        <w:t>。</w:t>
-      </w:r>
-    </w:p>
-    <w:p>
-      <w:pPr>
-        <w:jc w:val="both"/>
-      </w:pPr>
-      <w:r>
-        <w:t>反方向的基因流同样存在，而且估计值对方法和参照十分敏感。Thakur等（2018）比较印度57只野生红原鸡与79只家鸡，发现由家鸡流向自由活动红原鸡的定向基因流</w:t>
-      </w:r>
-      <w:r>
-        <w:rPr>
-          <w:vertAlign w:val="superscript"/>
-        </w:rPr>
-        <w:t>[129]</w:t>
-      </w:r>
-      <w:r>
-        <w:t>。Wu等（2023）以约一个世纪前的标本为野生参照，发现现代</w:t>
-      </w:r>
-      <w:r>
-        <w:rPr>
-          <w:i/>
-        </w:rPr>
-        <w:t>spadiceus</w:t>
-      </w:r>
-      <w:r>
-        <w:t>中的家鸡来源变异显著增加：全局祖源分析中多数现代个体有20%～50%来自家鸡；局部祖源分析中，泰北、曼尼普尔和云南个体的家鸡来源等位基因占83%～96%，只以商业品种作家鸡参照时降至30%～70%</w:t>
-      </w:r>
-      <w:r>
-        <w:rPr>
-          <w:vertAlign w:val="superscript"/>
-        </w:rPr>
-        <w:t>[12]</w:t>
-      </w:r>
-      <w:r>
-        <w:t>。作者也指出，把来源存疑的样本保守地归为村鸡，可能高估渗入的绝对水平</w:t>
-      </w:r>
-      <w:r>
-        <w:rPr>
-          <w:vertAlign w:val="superscript"/>
-        </w:rPr>
-        <w:t>[12]</w:t>
-      </w:r>
-      <w:r>
-        <w:t>。新加坡已没有半野化的村鸡，Wu等（2020）只能以Silkie和Bovans商业蛋鸡作家鸡参照，当地自由活动群体却呈现从野化到野生的连续梯度</w:t>
-      </w:r>
-      <w:r>
-        <w:rPr>
-          <w:vertAlign w:val="superscript"/>
-        </w:rPr>
-        <w:t>[130]</w:t>
-      </w:r>
-      <w:r>
-        <w:t>。外形同样不可靠：Peterson和Brisbin由745件博物馆标本推测多数野生群体已受家鸡渗入，回交实验又显示，常用的原鸡“纯度”外形指标在含家鸡成分的后代中也会出现</w:t>
-      </w:r>
-      <w:r>
-        <w:rPr>
-          <w:vertAlign w:val="superscript"/>
-        </w:rPr>
-        <w:t>[131,132]</w:t>
-      </w:r>
-      <w:r>
-        <w:t>。现代红原鸡因此难以直接充当野生参照（见第3.2节）。</w:t>
-      </w:r>
-    </w:p>
-    <w:p>
-      <w:pPr>
-        <w:jc w:val="both"/>
-      </w:pPr>
-      <w:r>
-        <w:t>野化群体提供了另一类材料。Gering等（2015）发现，Kauai野化鸡有两支差异明显的线粒体谱系：少见的一支与红原鸡及欧洲人到来前的Kauai古DNA同属，可能由古代波利尼西亚人带入；常见的一支见于世界各地，包括近代欧洲育成的品种</w:t>
-      </w:r>
-      <w:r>
-        <w:rPr>
-          <w:vertAlign w:val="superscript"/>
-        </w:rPr>
-        <w:t>[133]</w:t>
-      </w:r>
-      <w:r>
-        <w:t>。作者认为现今群体源于近代家鸡对古老“红原鸡”种群的侵入</w:t>
-      </w:r>
-      <w:r>
-        <w:rPr>
-          <w:vertAlign w:val="superscript"/>
-        </w:rPr>
-        <w:t>[133]</w:t>
-      </w:r>
-      <w:r>
-        <w:t>。Martin Cerezo等（2023）记述，岛上在1939年还放归过857只太平洋红原鸡；他们检出红原鸡和白来航蛋鸡的贡献，按约半年的世代时间估计混合时间为1981年（1976～1995年），与1982年和1992年飓风后家鸡大量逸出相符</w:t>
-      </w:r>
-      <w:r>
-        <w:rPr>
-          <w:vertAlign w:val="superscript"/>
-        </w:rPr>
-        <w:t>[134]</w:t>
-      </w:r>
-      <w:r>
-        <w:t>。Kauai野化鸡的选择扫描区大多不同于驯化相关区域</w:t>
-      </w:r>
-      <w:r>
-        <w:rPr>
-          <w:vertAlign w:val="superscript"/>
-        </w:rPr>
-        <w:t>[135]</w:t>
-      </w:r>
-      <w:r>
-        <w:t>。Gering等（2024）比较独立形成的百慕大与Kauai野化群体，前者较多含褐壳蛋鸡和肉鸡背景，后者较多含白壳蛋鸡背景，两地共同选择扫描区的单倍型主要为家养来源</w:t>
-      </w:r>
-      <w:r>
-        <w:rPr>
-          <w:vertAlign w:val="superscript"/>
-        </w:rPr>
-        <w:t>[136]</w:t>
-      </w:r>
-      <w:r>
-        <w:t>。Kauai的“红原鸡”本身源自人类引入，与原生分布区不同；新加坡的连续梯度则说明，原生分布区内同样存在野化家鸡与红原鸡的混合。</w:t>
-      </w:r>
-    </w:p>
-    <w:p>
-      <w:pPr>
-        <w:jc w:val="both"/>
-      </w:pPr>
-      <w:r>
-        <w:t>据此，家鸡来源进入红原鸡的途径可以区分为三条：商业系或其后代与红原鸡直接杂交；商业种源先进入放养地方鸡，再经地方鸡传入红原鸡；逸出或放归的家鸡先形成野化群体，再与红原鸡杂交。现有研究尚未在同一地区沿第二条途径追踪到连续的传递。检验时可在同一地区同时采集红原鸡、放养地方鸡和当地使用的商业系，以历史红原鸡、地方鸡和商业系作为分开的参照推断局部祖源，并核对混合时间是否与引种记录相符</w:t>
-      </w:r>
-      <w:r>
-        <w:rPr>
-          <w:vertAlign w:val="superscript"/>
-        </w:rPr>
-        <w:t>[12,134]</w:t>
-      </w:r>
-      <w:r>
-        <w:t>。</w:t>
-      </w:r>
-    </w:p>
-    <w:p>
-      <w:pPr>
-        <w:pStyle w:val="Heading2"/>
-        <w:jc w:val="left"/>
-      </w:pPr>
-      <w:r>
-        <w:t>7.4 对来源推断与保护的含义</w:t>
-      </w:r>
-    </w:p>
-    <w:p>
-      <w:pPr>
-        <w:jc w:val="both"/>
-      </w:pPr>
-      <w:r>
-        <w:t>以上资料表明，研究家鸡来源所用的参照群体各有历史（表2）。现代红原鸡含程度不一的家鸡渗入</w:t>
-      </w:r>
-      <w:r>
-        <w:rPr>
-          <w:vertAlign w:val="superscript"/>
-        </w:rPr>
-        <w:t>[12]</w:t>
-      </w:r>
-      <w:r>
-        <w:t>，一个多世纪前的标本也已带有与部分渗入相符的信号</w:t>
-      </w:r>
-      <w:r>
-        <w:rPr>
-          <w:vertAlign w:val="superscript"/>
-        </w:rPr>
-        <w:t>[130]</w:t>
-      </w:r>
-      <w:r>
-        <w:t>；动物园红原鸡经历严重瓶颈，纯合片段极长，还可能含家鸡成分</w:t>
-      </w:r>
-      <w:r>
-        <w:rPr>
-          <w:vertAlign w:val="superscript"/>
-        </w:rPr>
-        <w:t>[137]</w:t>
-      </w:r>
-      <w:r>
-        <w:t>。第4.3节的选择线起始于两个圈养种群，其一来自哥本哈根动物园</w:t>
-      </w:r>
-      <w:r>
-        <w:rPr>
-          <w:vertAlign w:val="superscript"/>
-        </w:rPr>
-        <w:t>[56]</w:t>
-      </w:r>
-      <w:r>
-        <w:t>，第3.3节的灰原鸡参照也来自圈养繁育群体</w:t>
-      </w:r>
-      <w:r>
-        <w:rPr>
-          <w:vertAlign w:val="superscript"/>
-        </w:rPr>
-        <w:t>[30]</w:t>
-      </w:r>
-      <w:r>
-        <w:t>，相关结果外推到野生祖先时需考虑这一来源。群体结构分析中的祖源比例还受样本构成和遗传漂变影响，没有近期混合的群体也可能被拟合为混合</w:t>
-      </w:r>
-      <w:r>
-        <w:rPr>
-          <w:vertAlign w:val="superscript"/>
-        </w:rPr>
-        <w:t>[138]</w:t>
-      </w:r>
-      <w:r>
-        <w:t>，不能直接读作混合事件的比例或次数。较稳妥的做法是交代参照群体的来源和历史，像Wu等那样报告更换参照后的敏感性</w:t>
-      </w:r>
-      <w:r>
-        <w:rPr>
-          <w:vertAlign w:val="superscript"/>
-        </w:rPr>
-        <w:t>[12]</w:t>
-      </w:r>
-      <w:r>
-        <w:t>，并用古代或历史样本以及混合时间估计确定变化的先后</w:t>
-      </w:r>
-      <w:r>
-        <w:rPr>
-          <w:vertAlign w:val="superscript"/>
-        </w:rPr>
-        <w:t>[90,134]</w:t>
-      </w:r>
-      <w:r>
-        <w:t>。</w:t>
-      </w:r>
-    </w:p>
-    <w:p>
-      <w:pPr>
-        <w:pStyle w:val="Caption"/>
-        <w:keepNext/>
-        <w:jc w:val="left"/>
-      </w:pPr>
-      <w:r>
-        <w:t>表2 研究家鸡来源常用参照群体的历史与局限</w:t>
-      </w:r>
-    </w:p>
-    <w:tbl>
-      <w:tblPr>
-        <w:tblW w:type="auto" w:w="0"/>
-        <w:jc w:val="center"/>
-        <w:tblLayout w:type="fixed"/>
-        <w:tblLook w:firstColumn="1" w:firstRow="1" w:lastColumn="0" w:lastRow="0" w:noHBand="0" w:noVBand="1" w:val="04A0"/>
-        <w:tblBorders>
-          <w:top w:val="single" w:sz="4" w:color="D9D9D9"/>
-          <w:left w:val="single" w:sz="4" w:color="D9D9D9"/>
-          <w:bottom w:val="single" w:sz="4" w:color="D9D9D9"/>
-          <w:right w:val="single" w:sz="4" w:color="D9D9D9"/>
-          <w:insideH w:val="single" w:sz="4" w:color="D9D9D9"/>
-          <w:insideV w:val="single" w:sz="4" w:color="D9D9D9"/>
-        </w:tblBorders>
-      </w:tblPr>
-      <w:tblGrid>
-        <w:gridCol w:w="1701"/>
-        <w:gridCol w:w="3402"/>
-        <w:gridCol w:w="3515"/>
-        <w:gridCol w:w="1020"/>
-      </w:tblGrid>
-      <w:tr>
-        <w:trPr>
-          <w:cantSplit/>
-          <w:tblHeader w:val="true"/>
-        </w:trPr>
-        <w:tc>
-          <w:tcPr>
-            <w:tcW w:type="dxa" w:w="1701"/>
-            <w:vAlign w:val="center"/>
-            <w:tcMar>
-              <w:top w:w="50" w:type="dxa"/>
-              <w:left w:w="85" w:type="dxa"/>
-              <w:bottom w:w="50" w:type="dxa"/>
-              <w:right w:w="85" w:type="dxa"/>
-            </w:tcMar>
-            <w:shd w:fill="EDEDED"/>
-          </w:tcPr>
-          <w:p>
-            <w:pPr>
-              <w:spacing w:after="0" w:line="276" w:lineRule="auto"/>
-              <w:ind w:firstLine="0"/>
-              <w:jc w:val="center"/>
-            </w:pPr>
-            <w:r>
-              <w:rPr>
-                <w:b/>
-                <w:sz w:val="20"/>
-              </w:rPr>
-              <w:t>参照群体</w:t>
-            </w:r>
-          </w:p>
-        </w:tc>
-        <w:tc>
-          <w:tcPr>
-            <w:tcW w:type="dxa" w:w="3402"/>
-            <w:vAlign w:val="center"/>
-            <w:tcMar>
-              <w:top w:w="50" w:type="dxa"/>
-              <w:left w:w="85" w:type="dxa"/>
-              <w:bottom w:w="50" w:type="dxa"/>
-              <w:right w:w="85" w:type="dxa"/>
-            </w:tcMar>
-            <w:shd w:fill="EDEDED"/>
-          </w:tcPr>
-          <w:p>
-            <w:pPr>
-              <w:spacing w:after="0" w:line="276" w:lineRule="auto"/>
-              <w:ind w:firstLine="0"/>
-              <w:jc w:val="center"/>
-            </w:pPr>
-            <w:r>
-              <w:rPr>
-                <w:b/>
-                <w:sz w:val="20"/>
-              </w:rPr>
-              <w:t>已知的历史或问题</w:t>
-            </w:r>
-          </w:p>
-        </w:tc>
-        <w:tc>
-          <w:tcPr>
-            <w:tcW w:type="dxa" w:w="3515"/>
-            <w:vAlign w:val="center"/>
-            <w:tcMar>
-              <w:top w:w="50" w:type="dxa"/>
-              <w:left w:w="85" w:type="dxa"/>
-              <w:bottom w:w="50" w:type="dxa"/>
-              <w:right w:w="85" w:type="dxa"/>
-            </w:tcMar>
-            <w:shd w:fill="EDEDED"/>
-          </w:tcPr>
-          <w:p>
-            <w:pPr>
-              <w:spacing w:after="0" w:line="276" w:lineRule="auto"/>
-              <w:ind w:firstLine="0"/>
-              <w:jc w:val="center"/>
-            </w:pPr>
-            <w:r>
-              <w:rPr>
-                <w:b/>
-                <w:sz w:val="20"/>
-              </w:rPr>
-              <w:t>对推断的影响</w:t>
-            </w:r>
-          </w:p>
-        </w:tc>
-        <w:tc>
-          <w:tcPr>
-            <w:tcW w:type="dxa" w:w="1020"/>
-            <w:vAlign w:val="center"/>
-            <w:tcMar>
-              <w:top w:w="50" w:type="dxa"/>
-              <w:left w:w="85" w:type="dxa"/>
-              <w:bottom w:w="50" w:type="dxa"/>
-              <w:right w:w="85" w:type="dxa"/>
-            </w:tcMar>
-            <w:shd w:fill="EDEDED"/>
-          </w:tcPr>
-          <w:p>
-            <w:pPr>
-              <w:spacing w:after="0" w:line="276" w:lineRule="auto"/>
-              <w:ind w:firstLine="0"/>
-              <w:jc w:val="center"/>
-            </w:pPr>
-            <w:r>
-              <w:rPr>
-                <w:b/>
-                <w:sz w:val="20"/>
-              </w:rPr>
-              <w:t>文献</w:t>
-            </w:r>
-          </w:p>
-        </w:tc>
-      </w:tr>
-      <w:tr>
-        <w:trPr>
-          <w:cantSplit/>
-        </w:trPr>
-        <w:tc>
-          <w:tcPr>
-            <w:tcW w:type="dxa" w:w="1701"/>
-            <w:vAlign w:val="center"/>
-            <w:tcMar>
-              <w:top w:w="50" w:type="dxa"/>
-              <w:left w:w="85" w:type="dxa"/>
-              <w:bottom w:w="50" w:type="dxa"/>
-              <w:right w:w="85" w:type="dxa"/>
-            </w:tcMar>
-          </w:tcPr>
-          <w:p>
-            <w:pPr>
-              <w:spacing w:after="0" w:line="276" w:lineRule="auto"/>
-              <w:ind w:firstLine="0"/>
-              <w:jc w:val="left"/>
-            </w:pPr>
-            <w:r>
-              <w:rPr>
-                <w:sz w:val="20"/>
-              </w:rPr>
-              <w:t>现代野生红原鸡</w:t>
-            </w:r>
-          </w:p>
-        </w:tc>
-        <w:tc>
-          <w:tcPr>
-            <w:tcW w:type="dxa" w:w="3402"/>
-            <w:vAlign w:val="center"/>
-            <w:tcMar>
-              <w:top w:w="50" w:type="dxa"/>
-              <w:left w:w="85" w:type="dxa"/>
-              <w:bottom w:w="50" w:type="dxa"/>
-              <w:right w:w="85" w:type="dxa"/>
-            </w:tcMar>
-          </w:tcPr>
-          <w:p>
-            <w:pPr>
-              <w:spacing w:after="0" w:line="276" w:lineRule="auto"/>
-              <w:ind w:firstLine="0"/>
-              <w:jc w:val="left"/>
-            </w:pPr>
-            <w:r>
-              <w:rPr>
-                <w:sz w:val="20"/>
-              </w:rPr>
-              <w:t>家鸡渗入程度因地区和个体而异，估计值随方法和参照变化</w:t>
-            </w:r>
-          </w:p>
-        </w:tc>
-        <w:tc>
-          <w:tcPr>
-            <w:tcW w:type="dxa" w:w="3515"/>
-            <w:vAlign w:val="center"/>
-            <w:tcMar>
-              <w:top w:w="50" w:type="dxa"/>
-              <w:left w:w="85" w:type="dxa"/>
-              <w:bottom w:w="50" w:type="dxa"/>
-              <w:right w:w="85" w:type="dxa"/>
-            </w:tcMar>
-          </w:tcPr>
-          <w:p>
-            <w:pPr>
-              <w:spacing w:after="0" w:line="276" w:lineRule="auto"/>
-              <w:ind w:firstLine="0"/>
-              <w:jc w:val="left"/>
-            </w:pPr>
-            <w:r>
-              <w:rPr>
-                <w:sz w:val="20"/>
-              </w:rPr>
-              <w:t>抬高与家鸡的共享变异；在现代红原鸡中已被家鸡来源拷贝同质化的驯化候选基因，以其为野生参照时无法检出</w:t>
-            </w:r>
-          </w:p>
-        </w:tc>
-        <w:tc>
-          <w:tcPr>
-            <w:tcW w:type="dxa" w:w="1020"/>
-            <w:vAlign w:val="center"/>
-            <w:tcMar>
-              <w:top w:w="50" w:type="dxa"/>
-              <w:left w:w="85" w:type="dxa"/>
-              <w:bottom w:w="50" w:type="dxa"/>
-              <w:right w:w="85" w:type="dxa"/>
-            </w:tcMar>
-          </w:tcPr>
-          <w:p>
-            <w:pPr>
-              <w:spacing w:after="0" w:line="276" w:lineRule="auto"/>
-              <w:ind w:firstLine="0"/>
-              <w:jc w:val="center"/>
-            </w:pPr>
-            <w:r>
-              <w:rPr>
-                <w:sz w:val="20"/>
-                <w:vertAlign w:val="superscript"/>
-              </w:rPr>
-              <w:t>[12,129,130]</w:t>
-            </w:r>
-          </w:p>
-        </w:tc>
-      </w:tr>
-      <w:tr>
-        <w:trPr>
-          <w:cantSplit/>
-        </w:trPr>
-        <w:tc>
-          <w:tcPr>
-            <w:tcW w:type="dxa" w:w="1701"/>
-            <w:vAlign w:val="center"/>
-            <w:tcMar>
-              <w:top w:w="50" w:type="dxa"/>
-              <w:left w:w="85" w:type="dxa"/>
-              <w:bottom w:w="50" w:type="dxa"/>
-              <w:right w:w="85" w:type="dxa"/>
-            </w:tcMar>
-          </w:tcPr>
-          <w:p>
-            <w:pPr>
-              <w:spacing w:after="0" w:line="276" w:lineRule="auto"/>
-              <w:ind w:firstLine="0"/>
-              <w:jc w:val="left"/>
-            </w:pPr>
-            <w:r>
-              <w:rPr>
-                <w:sz w:val="20"/>
-              </w:rPr>
-              <w:t>圈养与动物园红原鸡</w:t>
-            </w:r>
-          </w:p>
-        </w:tc>
-        <w:tc>
-          <w:tcPr>
-            <w:tcW w:type="dxa" w:w="3402"/>
-            <w:vAlign w:val="center"/>
-            <w:tcMar>
-              <w:top w:w="50" w:type="dxa"/>
-              <w:left w:w="85" w:type="dxa"/>
-              <w:bottom w:w="50" w:type="dxa"/>
-              <w:right w:w="85" w:type="dxa"/>
-            </w:tcMar>
-          </w:tcPr>
-          <w:p>
-            <w:pPr>
-              <w:spacing w:after="0" w:line="276" w:lineRule="auto"/>
-              <w:ind w:firstLine="0"/>
-              <w:jc w:val="left"/>
-            </w:pPr>
-            <w:r>
-              <w:rPr>
-                <w:sz w:val="20"/>
-              </w:rPr>
-              <w:t>严重瓶颈、长纯合片段，可能含家鸡成分</w:t>
-            </w:r>
-          </w:p>
-        </w:tc>
-        <w:tc>
-          <w:tcPr>
-            <w:tcW w:type="dxa" w:w="3515"/>
-            <w:vAlign w:val="center"/>
-            <w:tcMar>
-              <w:top w:w="50" w:type="dxa"/>
-              <w:left w:w="85" w:type="dxa"/>
-              <w:bottom w:w="50" w:type="dxa"/>
-              <w:right w:w="85" w:type="dxa"/>
-            </w:tcMar>
-          </w:tcPr>
-          <w:p>
-            <w:pPr>
-              <w:spacing w:after="0" w:line="276" w:lineRule="auto"/>
-              <w:ind w:firstLine="0"/>
-              <w:jc w:val="left"/>
-            </w:pPr>
-            <w:r>
-              <w:rPr>
-                <w:sz w:val="20"/>
-              </w:rPr>
-              <w:t>多样性偏低；以其为起始群体的选择线和互交实验，外推到野生祖先时须谨慎</w:t>
-            </w:r>
-          </w:p>
-        </w:tc>
-        <w:tc>
-          <w:tcPr>
-            <w:tcW w:type="dxa" w:w="1020"/>
-            <w:vAlign w:val="center"/>
-            <w:tcMar>
-              <w:top w:w="50" w:type="dxa"/>
-              <w:left w:w="85" w:type="dxa"/>
-              <w:bottom w:w="50" w:type="dxa"/>
-              <w:right w:w="85" w:type="dxa"/>
-            </w:tcMar>
-          </w:tcPr>
-          <w:p>
-            <w:pPr>
-              <w:spacing w:after="0" w:line="276" w:lineRule="auto"/>
-              <w:ind w:firstLine="0"/>
-              <w:jc w:val="center"/>
-            </w:pPr>
-            <w:r>
-              <w:rPr>
-                <w:sz w:val="20"/>
-                <w:vertAlign w:val="superscript"/>
-              </w:rPr>
-              <w:t>[56,137]</w:t>
-            </w:r>
-          </w:p>
-        </w:tc>
-      </w:tr>
-      <w:tr>
-        <w:trPr>
-          <w:cantSplit/>
-        </w:trPr>
-        <w:tc>
-          <w:tcPr>
-            <w:tcW w:type="dxa" w:w="1701"/>
-            <w:vAlign w:val="center"/>
-            <w:tcMar>
-              <w:top w:w="50" w:type="dxa"/>
-              <w:left w:w="85" w:type="dxa"/>
-              <w:bottom w:w="50" w:type="dxa"/>
-              <w:right w:w="85" w:type="dxa"/>
-            </w:tcMar>
-          </w:tcPr>
-          <w:p>
-            <w:pPr>
-              <w:spacing w:after="0" w:line="276" w:lineRule="auto"/>
-              <w:ind w:firstLine="0"/>
-              <w:jc w:val="left"/>
-            </w:pPr>
-            <w:r>
-              <w:rPr>
-                <w:sz w:val="20"/>
-              </w:rPr>
-              <w:t>历史标本</w:t>
-            </w:r>
-          </w:p>
-        </w:tc>
-        <w:tc>
-          <w:tcPr>
-            <w:tcW w:type="dxa" w:w="3402"/>
-            <w:vAlign w:val="center"/>
-            <w:tcMar>
-              <w:top w:w="50" w:type="dxa"/>
-              <w:left w:w="85" w:type="dxa"/>
-              <w:bottom w:w="50" w:type="dxa"/>
-              <w:right w:w="85" w:type="dxa"/>
-            </w:tcMar>
-          </w:tcPr>
-          <w:p>
-            <w:pPr>
-              <w:spacing w:after="0" w:line="276" w:lineRule="auto"/>
-              <w:ind w:firstLine="0"/>
-              <w:jc w:val="left"/>
-            </w:pPr>
-            <w:r>
-              <w:rPr>
-                <w:sz w:val="20"/>
-              </w:rPr>
-              <w:t>数量有限，需按古DNA方法测序；一个多世纪前的个体已可能带有渗入</w:t>
-            </w:r>
-          </w:p>
-        </w:tc>
-        <w:tc>
-          <w:tcPr>
-            <w:tcW w:type="dxa" w:w="3515"/>
-            <w:vAlign w:val="center"/>
-            <w:tcMar>
-              <w:top w:w="50" w:type="dxa"/>
-              <w:left w:w="85" w:type="dxa"/>
-              <w:bottom w:w="50" w:type="dxa"/>
-              <w:right w:w="85" w:type="dxa"/>
-            </w:tcMar>
-          </w:tcPr>
-          <w:p>
-            <w:pPr>
-              <w:spacing w:after="0" w:line="276" w:lineRule="auto"/>
-              <w:ind w:firstLine="0"/>
-              <w:jc w:val="left"/>
-            </w:pPr>
-            <w:r>
-              <w:rPr>
-                <w:sz w:val="20"/>
-              </w:rPr>
-              <w:t>可作受近期渗入影响较小的参照，不宜视为“纯”野生</w:t>
-            </w:r>
-          </w:p>
-        </w:tc>
-        <w:tc>
-          <w:tcPr>
-            <w:tcW w:type="dxa" w:w="1020"/>
-            <w:vAlign w:val="center"/>
-            <w:tcMar>
-              <w:top w:w="50" w:type="dxa"/>
-              <w:left w:w="85" w:type="dxa"/>
-              <w:bottom w:w="50" w:type="dxa"/>
-              <w:right w:w="85" w:type="dxa"/>
-            </w:tcMar>
-          </w:tcPr>
-          <w:p>
-            <w:pPr>
-              <w:spacing w:after="0" w:line="276" w:lineRule="auto"/>
-              <w:ind w:firstLine="0"/>
-              <w:jc w:val="center"/>
-            </w:pPr>
-            <w:r>
-              <w:rPr>
-                <w:sz w:val="20"/>
-                <w:vertAlign w:val="superscript"/>
-              </w:rPr>
-              <w:t>[12,130]</w:t>
-            </w:r>
-          </w:p>
-        </w:tc>
-      </w:tr>
-      <w:tr>
-        <w:trPr>
-          <w:cantSplit/>
-        </w:trPr>
-        <w:tc>
-          <w:tcPr>
-            <w:tcW w:type="dxa" w:w="1701"/>
-            <w:vAlign w:val="center"/>
-            <w:tcMar>
-              <w:top w:w="50" w:type="dxa"/>
-              <w:left w:w="85" w:type="dxa"/>
-              <w:bottom w:w="50" w:type="dxa"/>
-              <w:right w:w="85" w:type="dxa"/>
-            </w:tcMar>
-          </w:tcPr>
-          <w:p>
-            <w:pPr>
-              <w:spacing w:after="0" w:line="276" w:lineRule="auto"/>
-              <w:ind w:firstLine="0"/>
-              <w:jc w:val="left"/>
-            </w:pPr>
-            <w:r>
-              <w:rPr>
-                <w:sz w:val="20"/>
-              </w:rPr>
-              <w:t>商业系</w:t>
-            </w:r>
-          </w:p>
-        </w:tc>
-        <w:tc>
-          <w:tcPr>
-            <w:tcW w:type="dxa" w:w="3402"/>
-            <w:vAlign w:val="center"/>
-            <w:tcMar>
-              <w:top w:w="50" w:type="dxa"/>
-              <w:left w:w="85" w:type="dxa"/>
-              <w:bottom w:w="50" w:type="dxa"/>
-              <w:right w:w="85" w:type="dxa"/>
-            </w:tcMar>
-          </w:tcPr>
-          <w:p>
-            <w:pPr>
-              <w:spacing w:after="0" w:line="276" w:lineRule="auto"/>
-              <w:ind w:firstLine="0"/>
-              <w:jc w:val="left"/>
-            </w:pPr>
-            <w:r>
-              <w:rPr>
-                <w:sz w:val="20"/>
-              </w:rPr>
-              <w:t>近代由多个来源组合而成，部分祖先变异缺失</w:t>
-            </w:r>
-          </w:p>
-        </w:tc>
-        <w:tc>
-          <w:tcPr>
-            <w:tcW w:type="dxa" w:w="3515"/>
-            <w:vAlign w:val="center"/>
-            <w:tcMar>
-              <w:top w:w="50" w:type="dxa"/>
-              <w:left w:w="85" w:type="dxa"/>
-              <w:bottom w:w="50" w:type="dxa"/>
-              <w:right w:w="85" w:type="dxa"/>
-            </w:tcMar>
-          </w:tcPr>
-          <w:p>
-            <w:pPr>
-              <w:spacing w:after="0" w:line="276" w:lineRule="auto"/>
-              <w:ind w:firstLine="0"/>
-              <w:jc w:val="left"/>
-            </w:pPr>
-            <w:r>
-              <w:rPr>
-                <w:sz w:val="20"/>
-              </w:rPr>
-              <w:t>只代表家鸡变异的一部分；与地方鸡共享的片段可能来自共同的亚洲来源</w:t>
-            </w:r>
-          </w:p>
-        </w:tc>
-        <w:tc>
-          <w:tcPr>
-            <w:tcW w:type="dxa" w:w="1020"/>
-            <w:vAlign w:val="center"/>
-            <w:tcMar>
-              <w:top w:w="50" w:type="dxa"/>
-              <w:left w:w="85" w:type="dxa"/>
-              <w:bottom w:w="50" w:type="dxa"/>
-              <w:right w:w="85" w:type="dxa"/>
-            </w:tcMar>
-          </w:tcPr>
-          <w:p>
-            <w:pPr>
-              <w:spacing w:after="0" w:line="276" w:lineRule="auto"/>
-              <w:ind w:firstLine="0"/>
-              <w:jc w:val="center"/>
-            </w:pPr>
-            <w:r>
-              <w:rPr>
-                <w:sz w:val="20"/>
-                <w:vertAlign w:val="superscript"/>
-              </w:rPr>
-              <w:t>[117,118,120]</w:t>
-            </w:r>
-          </w:p>
-        </w:tc>
-      </w:tr>
-      <w:tr>
-        <w:trPr>
-          <w:cantSplit/>
-        </w:trPr>
-        <w:tc>
-          <w:tcPr>
-            <w:tcW w:type="dxa" w:w="1701"/>
-            <w:vAlign w:val="center"/>
-            <w:tcMar>
-              <w:top w:w="50" w:type="dxa"/>
-              <w:left w:w="85" w:type="dxa"/>
-              <w:bottom w:w="50" w:type="dxa"/>
-              <w:right w:w="85" w:type="dxa"/>
-            </w:tcMar>
-          </w:tcPr>
-          <w:p>
-            <w:pPr>
-              <w:spacing w:after="0" w:line="276" w:lineRule="auto"/>
-              <w:ind w:firstLine="0"/>
-              <w:jc w:val="left"/>
-            </w:pPr>
-            <w:r>
-              <w:rPr>
-                <w:sz w:val="20"/>
-              </w:rPr>
-              <w:t>地方鸡</w:t>
-            </w:r>
-          </w:p>
-        </w:tc>
-        <w:tc>
-          <w:tcPr>
-            <w:tcW w:type="dxa" w:w="3402"/>
-            <w:vAlign w:val="center"/>
-            <w:tcMar>
-              <w:top w:w="50" w:type="dxa"/>
-              <w:left w:w="85" w:type="dxa"/>
-              <w:bottom w:w="50" w:type="dxa"/>
-              <w:right w:w="85" w:type="dxa"/>
-            </w:tcMar>
-          </w:tcPr>
-          <w:p>
-            <w:pPr>
-              <w:spacing w:after="0" w:line="276" w:lineRule="auto"/>
-              <w:ind w:firstLine="0"/>
-              <w:jc w:val="left"/>
-            </w:pPr>
-            <w:r>
-              <w:rPr>
-                <w:sz w:val="20"/>
-              </w:rPr>
-              <w:t>含程度不一的商业成分和多次引种形成的来源层次</w:t>
-            </w:r>
-          </w:p>
-        </w:tc>
-        <w:tc>
-          <w:tcPr>
-            <w:tcW w:type="dxa" w:w="3515"/>
-            <w:vAlign w:val="center"/>
-            <w:tcMar>
-              <w:top w:w="50" w:type="dxa"/>
-              <w:left w:w="85" w:type="dxa"/>
-              <w:bottom w:w="50" w:type="dxa"/>
-              <w:right w:w="85" w:type="dxa"/>
-            </w:tcMar>
-          </w:tcPr>
-          <w:p>
-            <w:pPr>
-              <w:spacing w:after="0" w:line="276" w:lineRule="auto"/>
-              <w:ind w:firstLine="0"/>
-              <w:jc w:val="left"/>
-            </w:pPr>
-            <w:r>
-              <w:rPr>
-                <w:sz w:val="20"/>
-              </w:rPr>
-              <w:t>不能直接代表最早传入的鸡群</w:t>
-            </w:r>
-          </w:p>
-        </w:tc>
-        <w:tc>
-          <w:tcPr>
-            <w:tcW w:type="dxa" w:w="1020"/>
-            <w:vAlign w:val="center"/>
-            <w:tcMar>
-              <w:top w:w="50" w:type="dxa"/>
-              <w:left w:w="85" w:type="dxa"/>
-              <w:bottom w:w="50" w:type="dxa"/>
-              <w:right w:w="85" w:type="dxa"/>
-            </w:tcMar>
-          </w:tcPr>
-          <w:p>
-            <w:pPr>
-              <w:spacing w:after="0" w:line="276" w:lineRule="auto"/>
-              <w:ind w:firstLine="0"/>
-              <w:jc w:val="center"/>
-            </w:pPr>
-            <w:r>
-              <w:rPr>
-                <w:sz w:val="20"/>
-                <w:vertAlign w:val="superscript"/>
-              </w:rPr>
-              <w:t>[10,11,116]</w:t>
-            </w:r>
-          </w:p>
-        </w:tc>
-      </w:tr>
-      <w:tr>
-        <w:trPr>
-          <w:cantSplit/>
-        </w:trPr>
-        <w:tc>
-          <w:tcPr>
-            <w:tcW w:type="dxa" w:w="1701"/>
-            <w:vAlign w:val="center"/>
-            <w:tcMar>
-              <w:top w:w="50" w:type="dxa"/>
-              <w:left w:w="85" w:type="dxa"/>
-              <w:bottom w:w="50" w:type="dxa"/>
-              <w:right w:w="85" w:type="dxa"/>
-            </w:tcMar>
-          </w:tcPr>
-          <w:p>
-            <w:pPr>
-              <w:spacing w:after="0" w:line="276" w:lineRule="auto"/>
-              <w:ind w:firstLine="0"/>
-              <w:jc w:val="left"/>
-            </w:pPr>
-            <w:r>
-              <w:rPr>
-                <w:sz w:val="20"/>
-              </w:rPr>
-              <w:t>古代样本</w:t>
-            </w:r>
-          </w:p>
-        </w:tc>
-        <w:tc>
-          <w:tcPr>
-            <w:tcW w:type="dxa" w:w="3402"/>
-            <w:vAlign w:val="center"/>
-            <w:tcMar>
-              <w:top w:w="50" w:type="dxa"/>
-              <w:left w:w="85" w:type="dxa"/>
-              <w:bottom w:w="50" w:type="dxa"/>
-              <w:right w:w="85" w:type="dxa"/>
-            </w:tcMar>
-          </w:tcPr>
-          <w:p>
-            <w:pPr>
-              <w:spacing w:after="0" w:line="276" w:lineRule="auto"/>
-              <w:ind w:firstLine="0"/>
-              <w:jc w:val="left"/>
-            </w:pPr>
-            <w:r>
-              <w:rPr>
-                <w:sz w:val="20"/>
-              </w:rPr>
-              <w:t>年代可由测年或出土背景限定，但个体和位点有限，如201 bp控制区和少数SNP</w:t>
-            </w:r>
-          </w:p>
-        </w:tc>
-        <w:tc>
-          <w:tcPr>
-            <w:tcW w:type="dxa" w:w="3515"/>
-            <w:vAlign w:val="center"/>
-            <w:tcMar>
-              <w:top w:w="50" w:type="dxa"/>
-              <w:left w:w="85" w:type="dxa"/>
-              <w:bottom w:w="50" w:type="dxa"/>
-              <w:right w:w="85" w:type="dxa"/>
-            </w:tcMar>
-          </w:tcPr>
-          <w:p>
-            <w:pPr>
-              <w:spacing w:after="0" w:line="276" w:lineRule="auto"/>
-              <w:ind w:firstLine="0"/>
-              <w:jc w:val="left"/>
-            </w:pPr>
-            <w:r>
-              <w:rPr>
-                <w:sz w:val="20"/>
-              </w:rPr>
-              <w:t>可为变化排序，难以覆盖全基因组</w:t>
-            </w:r>
-          </w:p>
-        </w:tc>
-        <w:tc>
-          <w:tcPr>
-            <w:tcW w:type="dxa" w:w="1020"/>
-            <w:vAlign w:val="center"/>
-            <w:tcMar>
-              <w:top w:w="50" w:type="dxa"/>
-              <w:left w:w="85" w:type="dxa"/>
-              <w:bottom w:w="50" w:type="dxa"/>
-              <w:right w:w="85" w:type="dxa"/>
-            </w:tcMar>
-          </w:tcPr>
-          <w:p>
-            <w:pPr>
-              <w:spacing w:after="0" w:line="276" w:lineRule="auto"/>
-              <w:ind w:firstLine="0"/>
-              <w:jc w:val="center"/>
-            </w:pPr>
-            <w:r>
-              <w:rPr>
-                <w:sz w:val="20"/>
-                <w:vertAlign w:val="superscript"/>
-              </w:rPr>
-              <w:t>[8,9,90]</w:t>
-            </w:r>
-          </w:p>
-        </w:tc>
-      </w:tr>
-    </w:tbl>
-    <w:p>
-      <w:pPr>
-        <w:pStyle w:val="Caption"/>
-        <w:jc w:val="left"/>
-      </w:pPr>
-      <w:r>
-        <w:t>表注：表中各项依据正文所引研究概括；“对推断的影响”指使用该类参照时可能出现的偏差，具体方向因研究设计而异。</w:t>
-      </w:r>
-    </w:p>
-    <w:p>
-      <w:pPr>
-        <w:jc w:val="both"/>
-      </w:pPr>
-      <w:r>
-        <w:t>这些来源层次也关系到保护。对红原鸡，Wu等（2020）把基因组估计与外形评分结合，给出可供保护管理者识别低渗入个体的外形阈值</w:t>
-      </w:r>
-      <w:r>
-        <w:rPr>
-          <w:vertAlign w:val="superscript"/>
-        </w:rPr>
-        <w:t>[130]</w:t>
-      </w:r>
-      <w:r>
-        <w:t>。对地方鸡，商业纯系缺失的祖先变异</w:t>
-      </w:r>
-      <w:r>
-        <w:rPr>
-          <w:vertAlign w:val="superscript"/>
-        </w:rPr>
-        <w:t>[120]</w:t>
-      </w:r>
-      <w:r>
-        <w:t>使地方品种成为保存多样性的重要来源；杂交可以提高地方鸡的生产表现</w:t>
-      </w:r>
-      <w:r>
-        <w:rPr>
-          <w:vertAlign w:val="superscript"/>
-        </w:rPr>
-        <w:t>[139]</w:t>
-      </w:r>
-      <w:r>
-        <w:t>，也被视为“以用促保”的补充策略</w:t>
-      </w:r>
-      <w:r>
-        <w:rPr>
-          <w:vertAlign w:val="superscript"/>
-        </w:rPr>
-        <w:t>[140]</w:t>
-      </w:r>
-      <w:r>
-        <w:t>，但杂交推广同时是商业成分进入地方鸡的渠道（见第7.2节）。北京油鸡2019年的随机保种群体与2010年相比，有效群体大小和总体祖源比例保持稳定，作者据此认为保种有效；同期核苷酸多样性由0.0022降至0.0020，近交系数由0.280升至0.328</w:t>
-      </w:r>
-      <w:r>
-        <w:rPr>
-          <w:vertAlign w:val="superscript"/>
-        </w:rPr>
-        <w:t>[141]</w:t>
-      </w:r>
-      <w:r>
-        <w:t>。保种评价因此需要同时考察祖源组成和群体内的遗传变异。</w:t>
+        <w:t>，为红原鸡的遗传监测提供了工具。</w:t>
       </w:r>
     </w:p>
     <w:p>
@@ -8131,7 +7069,7 @@
         <w:rPr>
           <w:sz w:val="20"/>
         </w:rPr>
-        <w:t xml:space="preserve"> Mwacharo, J.M.; Bjørnstad, G.; Mobegi, V.; Nomura, K.; Hanada, H.; Amano, T.; Han, J.L.; Hanotte, O. Mitochondrial DNA reveals multiple introductions of domestic chicken in East Africa. Molecular Phylogenetics and Evolution 2011, 58, 374–382. DOI: 10.1016/j.ympev.2010.11.027.</w:t>
+        <w:t xml:space="preserve"> Berthouly, C.; Leroy, G.; Van, T.N.; Thanh, H.H.; Bed’Hom, B.; Nguyen, B.T.; Vu Chi, C.; Monicat, F.; Tixier-Boichard, M.; Verrier, E.; et al. Genetic analysis of local Vietnamese chickens provides evidence of gene flow from wild to domestic populations. BMC Genetics 2009, 10, 1. DOI: 10.1186/1471-2156-10-1.</w:t>
       </w:r>
     </w:p>
     <w:p>
@@ -8151,7 +7089,7 @@
         <w:rPr>
           <w:sz w:val="20"/>
         </w:rPr>
-        <w:t xml:space="preserve"> Mwacharo, J.M.; Nomura, K.; Hanada, H.; Han, J.L.; Amano, T.; Hanotte, O. Reconstructing the origin and dispersal patterns of village chickens across East Africa: insights from autosomal markers. Molecular Ecology 2013, 22, 2683–2697. DOI: 10.1111/mec.12294.</w:t>
+        <w:t xml:space="preserve"> Berthouly-Salazar, C.; Rognon, X.; Nhu Van, T.; Gély, M.; Vu Chi, C.; Tixier-Boichard, M.; Bed’Hom, B.; Bruneau, N.; Verrier, E.; Maillard, J.-C.; et al. Vietnamese chickens: a gate towards Asian genetic diversity. BMC Genetics 2010, 11, 53. DOI: 10.1186/1471-2156-11-53.</w:t>
       </w:r>
     </w:p>
     <w:p>
@@ -8171,7 +7109,7 @@
         <w:rPr>
           <w:sz w:val="20"/>
         </w:rPr>
-        <w:t xml:space="preserve"> Al-Jumaili, A.S.; Boudali, S.F.; Kebede, A.; Al-Bayatti, S.A.; Essa, A.A.; Ahbara, A.; Aljumaah, R.S.; Alatiyat, R.M.; Mwacharo, J.M.; Bjørnstad, G.; et al. The maternal origin of indigenous domestic chicken from the Middle East, the north and the horn of Africa. BMC Genetics 2020, 21, 30. DOI: 10.1186/s12863-020-0830-0.</w:t>
+        <w:t xml:space="preserve"> Wattanadilokcahtkun, P.; Chalermwong, P.; Singchat, W.; Wongloet, W.; Chaiyes, A.; Tanglertpaibul, N.; Budi, T.; Panthum, T.; Ariyaraphong, N.; Ahmad, S.F.; et al. Genetic admixture and diversity in Thai domestic chickens revealed through analysis of Lao Pa Koi fighting cocks. PLOS ONE 2023, 18, e0289983. DOI: 10.1371/journal.pone.0289983.</w:t>
       </w:r>
     </w:p>
     <w:p>
@@ -8191,7 +7129,7 @@
         <w:rPr>
           <w:sz w:val="20"/>
         </w:rPr>
-        <w:t xml:space="preserve"> Herrera, M.B.; Kraitsek, S.; Alcalde, J.A.; Quiroz, D.; Revelo, H.; Alvarez, L.A.; Rosario, M.F.; Thomson, V.; Han, J.L.; Austin, J.J.; et al. European and Asian contribution to the genetic diversity of mainland South American chickens. Royal Society Open Science 2020, 7, 191558. DOI: 10.1098/rsos.191558.</w:t>
+        <w:t xml:space="preserve"> Wongloet, W.; Singchat, W.; Chaiyes, A.; Ali, H.; Piangporntip, S.; Ariyaraphong, N.; Budi, T.; Thienpreecha, W.; Wannakan, W.; Mungmee, A.; et al. Environmental and Socio–Cultural Factors Impacting the Unique Gene Pool Pattern of Mae Hong-Son Chicken. Animals 2023, 13, 1949. DOI: 10.3390/ani13121949.</w:t>
       </w:r>
     </w:p>
     <w:p>
@@ -8211,7 +7149,7 @@
         <w:rPr>
           <w:sz w:val="20"/>
         </w:rPr>
-        <w:t xml:space="preserve"> Luzuriaga-Neira, A.; Pérez-Pardal, L.; O’Rourke, S.M.; Villacís-Rivas, G.; Cueva-Castillo, F.; Escudero-Sánchez, G.; Aguirre-Pabón, J.C.; Ulloa-Núñez, A.; Rubilar-Quezada, M.; Vallinoto, M.; et al. The Local South American Chicken Populations Are a Melting-Pot of Genomic Diversity. Frontiers in Genetics 2019, 10, 1172. DOI: 10.3389/fgene.2019.01172.</w:t>
+        <w:t xml:space="preserve"> Budi, T.; Luu, A.H.; Singchat, W.; Wongloet, W.; Rey, J.; Kumnan, N.; Chalermwong, P.; Nguyen, C.P.T.; Panthum, T.; Tanglertpaibul, N.; et al. Purposive breeding strategies drive genetic differentiation in Thai fighting cock breeds. Genes &amp; Genomics 2024, 46, 1225–1237. DOI: 10.1007/s13258-024-01561-3.</w:t>
       </w:r>
     </w:p>
     <w:p>
@@ -8231,7 +7169,7 @@
         <w:rPr>
           <w:sz w:val="20"/>
         </w:rPr>
-        <w:t xml:space="preserve"> Guo, Y.; Lillie, M.; Zan, Y.; Beranger, J.; Martin, A.; Honaker, C.F.; Siegel, P.B.; Carlborg, Ö. A genomic inference of the White Plymouth Rock genealogy. Poultry Science 2019, 98, 5272–5280. DOI: 10.3382/ps/pez411.</w:t>
+        <w:t xml:space="preserve"> Xu, N.; Zhang, L.; Chen, F.; Feng, Z.; Zheng, J.; Li, D.; Zhao, Y.; Kang, X. Population structure, selection signal and introgression of gamecocks revealed by whole genome sequencing. Journal of Animal Science and Biotechnology 2025, 16, 22. DOI: 10.1186/s40104-025-01154-4.</w:t>
       </w:r>
     </w:p>
     <w:p>
@@ -8251,7 +7189,7 @@
         <w:rPr>
           <w:sz w:val="20"/>
         </w:rPr>
-        <w:t xml:space="preserve"> Guo, Y.; Ou, J.H.; Zan, Y.; Wang, Y.; Li, H.; Zhu, C.; Chen, K.; Zhou, X.; Hu, X.; Carlborg, Ö. Researching on the fine structure and admixture of the worldwide chicken population reveal connections between populations and important events in breeding history. Evolutionary Applications 2022, 15, 553–564. DOI: 10.1111/eva.13241.</w:t>
+        <w:t xml:space="preserve"> Thakur, M.; Fernandes, M.; Sathyakumar, S.; Singh, S.K.; Vijh, R.K.; Han, J.; Wu, D.D.; Zhang, Y.P. Understanding the cryptic introgression and mixed ancestry of Red Junglefowl in India. PLOS ONE 2018, 13, e0204351. DOI: 10.1371/journal.pone.0204351.</w:t>
       </w:r>
     </w:p>
     <w:p>
@@ -8271,7 +7209,7 @@
         <w:rPr>
           <w:sz w:val="20"/>
         </w:rPr>
-        <w:t xml:space="preserve"> Ren, X.; Zhao, X.; Li, H.; Wang, H.; Cheng, X.; Wang, G.; Li, X.; Qu, L. The origin patterns, admixture, and selection signatures of the global gamecock populations. Poultry Science 2025, 104, 105738. DOI: 10.1016/j.psj.2025.105738.</w:t>
+        <w:t xml:space="preserve"> Wu, M.Y.; Low, G.W.; Forcina, G.; van Grouw, H.; Lee, B.P.Y.-H.; Oh, R.R.Y.; Rheindt, F.E. Historic and modern genomes unveil a domestic introgression gradient in a wild red junglefowl population. Evolutionary Applications 2020, 13, 2300–2315. DOI: 10.1111/eva.13023.</w:t>
       </w:r>
     </w:p>
     <w:p>
@@ -8291,7 +7229,20 @@
         <w:rPr>
           <w:sz w:val="20"/>
         </w:rPr>
-        <w:t xml:space="preserve"> Muir, W.M.; Wong, G.K.S.; Zhang, Y.; Wang, J.; Groenen, M.A.M.; Crooijmans, R.P.M.A.; Megens, H.J.; Zhang, H.; Okimoto, R.; Vereijken, A.; et al. Genome-wide assessment of worldwide chicken SNP genetic diversity indicates significant absence of rare alleles in commercial breeds. Proceedings of the National Academy of Sciences of the United States of America 2008, 105, 17312–17317. DOI: 10.1073/pnas.0806569105.</w:t>
+        <w:t xml:space="preserve"> Peterson, A.T.; Brisbin, I.L., Jr. Genetic endangerment of wild Red Junglefowl </w:t>
+      </w:r>
+      <w:r>
+        <w:rPr>
+          <w:i/>
+          <w:sz w:val="20"/>
+        </w:rPr>
+        <w:t>Gallus gallus</w:t>
+      </w:r>
+      <w:r>
+        <w:rPr>
+          <w:sz w:val="20"/>
+        </w:rPr>
+        <w:t>? Bird Conservation International 1998, 8, 387–394. DOI: 10.1017/s0959270900002148.</w:t>
       </w:r>
     </w:p>
     <w:p>
@@ -8311,7 +7262,20 @@
         <w:rPr>
           <w:sz w:val="20"/>
         </w:rPr>
-        <w:t xml:space="preserve"> Chen, L.; Wang, X.; Cheng, D.; Chen, K.; Fan, Y.; Wu, G.; You, J.; Liu, S.; Mao, H.; Ren, J. Population genetic analyses of seven Chinese indigenous chicken breeds in a context of global breeds. Animal Genetics 2019, 50, 82–86. DOI: 10.1111/age.12732.</w:t>
+        <w:t xml:space="preserve"> Brisbin, I.L., Jr.; Peterson, A.T. Playing chicken with red junglefowl: identifying phenotypic markers of genetic purity in </w:t>
+      </w:r>
+      <w:r>
+        <w:rPr>
+          <w:i/>
+          <w:sz w:val="20"/>
+        </w:rPr>
+        <w:t>Gallus gallus</w:t>
+      </w:r>
+      <w:r>
+        <w:rPr>
+          <w:sz w:val="20"/>
+        </w:rPr>
+        <w:t>. Animal Conservation 2007, 10, 429–435. DOI: 10.1111/j.1469-1795.2007.00112.x.</w:t>
       </w:r>
     </w:p>
     <w:p>
@@ -8331,7 +7295,7 @@
         <w:rPr>
           <w:sz w:val="20"/>
         </w:rPr>
-        <w:t xml:space="preserve"> Qi, L.; Xiao, L.; Fu, R.; Nie, Q.; Zhang, X.; Luo, W. Genetic characteristics and selection signatures between Southern Chinese local and commercial chickens. Poultry Science 2024, 103, 103863. DOI: 10.1016/j.psj.2024.103863.</w:t>
+        <w:t xml:space="preserve"> Gering, E.; Johnsson, M.; Willis, P.; Getty, T.; Wright, D. Mixed ancestry and admixture in Kauai's feral chickens: invasion of domestic genes into ancient Red Junglefowl reservoirs. Molecular Ecology 2015, 24, 2112–2124. DOI: 10.1111/mec.13096.</w:t>
       </w:r>
     </w:p>
     <w:p>
@@ -8351,7 +7315,7 @@
         <w:rPr>
           <w:sz w:val="20"/>
         </w:rPr>
-        <w:t xml:space="preserve"> Mahammi, F.Z.; Gaouar, S.B.S.; Laloë, D.; Faugeras, R.; Tabet-Aoul, N.; Rognon, X.; Tixier-Boichard, M.; Saidi-Mehtar, N. A molecular analysis of the patterns of genetic diversity in local chickens from western Algeria in comparison with commercial lines and wild jungle fowls. Journal of Animal Breeding and Genetics 2016, 133, 59–70. DOI: 10.1111/jbg.12151.</w:t>
+        <w:t xml:space="preserve"> Martin Cerezo, M.L.; López, S.; van Dorp, L.; Hellenthal, G.; Johnsson, M.; Gering, E.; Henriksen, R.; Wright, D. Population structure and hybridisation in a population of Hawaiian feral chickens. Heredity 2023, 130, 154–162. DOI: 10.1038/s41437-022-00589-z.</w:t>
       </w:r>
     </w:p>
     <w:p>
@@ -8371,7 +7335,7 @@
         <w:rPr>
           <w:sz w:val="20"/>
         </w:rPr>
-        <w:t xml:space="preserve"> Mujyambere, V.; Adomako, K.; Ntawubizi, M.; Nyinawamwiza, L.; Uwihirwe, J.; Kena, A.W. Genetic diversity and relationship of Bugesera and Rwamagana indigenous chicken populations with SASSO chickens using DArTseq SNPs. PLOS ONE 2025, 20, e0331316. DOI: 10.1371/journal.pone.0331316.</w:t>
+        <w:t xml:space="preserve"> Johnsson, M.; Gering, E.; Willis, P.; Lopez, S.; Van Dorp, L.; Hellenthal, G.; Henriksen, R.; Friberg, U.; Wright, D. Feralisation targets different genomic loci to domestication in the chicken. Nature Communications 2016, 7, 12950. DOI: 10.1038/ncomms12950.</w:t>
       </w:r>
     </w:p>
     <w:p>
@@ -8391,7 +7355,20 @@
         <w:rPr>
           <w:sz w:val="20"/>
         </w:rPr>
-        <w:t xml:space="preserve"> Demir, E.; Argun Karsli, B.; Özdemir, D.; Bilginer, U.; Doğru, H.; Kaya, S.; Atmaca, V.; Tufan, N.; Demir, E.; Karsli, T. Genome-wide comparative analysis of variability and population structure between autochthonous Turkish chicken breeds and commercial hybrid lines. Poultry Science 2025, 104, 105193. DOI: 10.1016/j.psj.2025.105193.</w:t>
+        <w:t xml:space="preserve"> Gering, E.; Johnsson, M.; Theunissen, D.; Martin Cerezo, M.L.; Steep, A.; Getty, T.; Henriksen, R.; Wright, D. Signals of selection and ancestry in independently feral </w:t>
+      </w:r>
+      <w:r>
+        <w:rPr>
+          <w:i/>
+          <w:sz w:val="20"/>
+        </w:rPr>
+        <w:t>Gallus gallus</w:t>
+      </w:r>
+      <w:r>
+        <w:rPr>
+          <w:sz w:val="20"/>
+        </w:rPr>
+        <w:t xml:space="preserve"> populations. Molecular Ecology 2024, 33, e17336. DOI: 10.1111/mec.17336.</w:t>
       </w:r>
     </w:p>
     <w:p>
@@ -8411,7 +7388,7 @@
         <w:rPr>
           <w:sz w:val="20"/>
         </w:rPr>
-        <w:t xml:space="preserve"> Berthouly, C.; Leroy, G.; Van, T.N.; Thanh, H.H.; Bed’Hom, B.; Nguyen, B.T.; Vu Chi, C.; Monicat, F.; Tixier-Boichard, M.; Verrier, E.; et al. Genetic analysis of local Vietnamese chickens provides evidence of gene flow from wild to domestic populations. BMC Genetics 2009, 10, 1. DOI: 10.1186/1471-2156-10-1.</w:t>
+        <w:t xml:space="preserve"> Matsuda, Y.; Eda, M.; Ito, S.; Shimmura, T. Genomic origin and consequence of captive red junglefowl in zoological parks. BMC Genomics 2025, 26, 1138. DOI: 10.1186/s12864-025-12366-3.</w:t>
       </w:r>
     </w:p>
     <w:p>
@@ -8431,7 +7408,7 @@
         <w:rPr>
           <w:sz w:val="20"/>
         </w:rPr>
-        <w:t xml:space="preserve"> Berthouly-Salazar, C.; Rognon, X.; Nhu Van, T.; Gély, M.; Vu Chi, C.; Tixier-Boichard, M.; Bed’Hom, B.; Bruneau, N.; Verrier, E.; Maillard, J.-C.; et al. Vietnamese chickens: a gate towards Asian genetic diversity. BMC Genetics 2010, 11, 53. DOI: 10.1186/1471-2156-11-53.</w:t>
+        <w:t xml:space="preserve"> Lawson, D.J.; van Dorp, L.; Falush, D. A tutorial on how not to over-interpret STRUCTURE and ADMIXTURE bar plots. Nature Communications 2018, 9, 3258. DOI: 10.1038/s41467-018-05257-7.</w:t>
       </w:r>
     </w:p>
     <w:p>
@@ -8451,306 +7428,7 @@
         <w:rPr>
           <w:sz w:val="20"/>
         </w:rPr>
-        <w:t xml:space="preserve"> Wattanadilokcahtkun, P.; Chalermwong, P.; Singchat, W.; Wongloet, W.; Chaiyes, A.; Tanglertpaibul, N.; Budi, T.; Panthum, T.; Ariyaraphong, N.; Ahmad, S.F.; et al. Genetic admixture and diversity in Thai domestic chickens revealed through analysis of Lao Pa Koi fighting cocks. PLOS ONE 2023, 18, e0289983. DOI: 10.1371/journal.pone.0289983.</w:t>
-      </w:r>
-    </w:p>
-    <w:p>
-      <w:pPr>
-        <w:keepLines/>
-        <w:spacing w:after="80" w:line="276" w:lineRule="auto"/>
-        <w:ind w:hanging="400" w:left="400"/>
-        <w:jc w:val="left"/>
-      </w:pPr>
-      <w:r>
-        <w:rPr>
-          <w:sz w:val="20"/>
-        </w:rPr>
-        <w:t>[129]</w:t>
-      </w:r>
-      <w:r>
-        <w:rPr>
-          <w:sz w:val="20"/>
-        </w:rPr>
-        <w:t xml:space="preserve"> Thakur, M.; Fernandes, M.; Sathyakumar, S.; Singh, S.K.; Vijh, R.K.; Han, J.; Wu, D.D.; Zhang, Y.P. Understanding the cryptic introgression and mixed ancestry of Red Junglefowl in India. PLOS ONE 2018, 13, e0204351. DOI: 10.1371/journal.pone.0204351.</w:t>
-      </w:r>
-    </w:p>
-    <w:p>
-      <w:pPr>
-        <w:keepLines/>
-        <w:spacing w:after="80" w:line="276" w:lineRule="auto"/>
-        <w:ind w:hanging="400" w:left="400"/>
-        <w:jc w:val="left"/>
-      </w:pPr>
-      <w:r>
-        <w:rPr>
-          <w:sz w:val="20"/>
-        </w:rPr>
-        <w:t>[130]</w:t>
-      </w:r>
-      <w:r>
-        <w:rPr>
-          <w:sz w:val="20"/>
-        </w:rPr>
-        <w:t xml:space="preserve"> Wu, M.Y.; Low, G.W.; Forcina, G.; van Grouw, H.; Lee, B.P.Y.-H.; Oh, R.R.Y.; Rheindt, F.E. Historic and modern genomes unveil a domestic introgression gradient in a wild red junglefowl population. Evolutionary Applications 2020, 13, 2300–2315. DOI: 10.1111/eva.13023.</w:t>
-      </w:r>
-    </w:p>
-    <w:p>
-      <w:pPr>
-        <w:keepLines/>
-        <w:spacing w:after="80" w:line="276" w:lineRule="auto"/>
-        <w:ind w:hanging="400" w:left="400"/>
-        <w:jc w:val="left"/>
-      </w:pPr>
-      <w:r>
-        <w:rPr>
-          <w:sz w:val="20"/>
-        </w:rPr>
-        <w:t>[131]</w:t>
-      </w:r>
-      <w:r>
-        <w:rPr>
-          <w:sz w:val="20"/>
-        </w:rPr>
-        <w:t xml:space="preserve"> Peterson, A.T.; Brisbin, I.L., Jr. Genetic endangerment of wild Red Junglefowl </w:t>
-      </w:r>
-      <w:r>
-        <w:rPr>
-          <w:i/>
-          <w:sz w:val="20"/>
-        </w:rPr>
-        <w:t>Gallus gallus</w:t>
-      </w:r>
-      <w:r>
-        <w:rPr>
-          <w:sz w:val="20"/>
-        </w:rPr>
-        <w:t>? Bird Conservation International 1998, 8, 387–394. DOI: 10.1017/s0959270900002148.</w:t>
-      </w:r>
-    </w:p>
-    <w:p>
-      <w:pPr>
-        <w:keepLines/>
-        <w:spacing w:after="80" w:line="276" w:lineRule="auto"/>
-        <w:ind w:hanging="400" w:left="400"/>
-        <w:jc w:val="left"/>
-      </w:pPr>
-      <w:r>
-        <w:rPr>
-          <w:sz w:val="20"/>
-        </w:rPr>
-        <w:t>[132]</w:t>
-      </w:r>
-      <w:r>
-        <w:rPr>
-          <w:sz w:val="20"/>
-        </w:rPr>
-        <w:t xml:space="preserve"> Brisbin, I.L., Jr.; Peterson, A.T. Playing chicken with red junglefowl: identifying phenotypic markers of genetic purity in </w:t>
-      </w:r>
-      <w:r>
-        <w:rPr>
-          <w:i/>
-          <w:sz w:val="20"/>
-        </w:rPr>
-        <w:t>Gallus gallus</w:t>
-      </w:r>
-      <w:r>
-        <w:rPr>
-          <w:sz w:val="20"/>
-        </w:rPr>
-        <w:t>. Animal Conservation 2007, 10, 429–435. DOI: 10.1111/j.1469-1795.2007.00112.x.</w:t>
-      </w:r>
-    </w:p>
-    <w:p>
-      <w:pPr>
-        <w:keepLines/>
-        <w:spacing w:after="80" w:line="276" w:lineRule="auto"/>
-        <w:ind w:hanging="400" w:left="400"/>
-        <w:jc w:val="left"/>
-      </w:pPr>
-      <w:r>
-        <w:rPr>
-          <w:sz w:val="20"/>
-        </w:rPr>
-        <w:t>[133]</w:t>
-      </w:r>
-      <w:r>
-        <w:rPr>
-          <w:sz w:val="20"/>
-        </w:rPr>
-        <w:t xml:space="preserve"> Gering, E.; Johnsson, M.; Willis, P.; Getty, T.; Wright, D. Mixed ancestry and admixture in Kauai's feral chickens: invasion of domestic genes into ancient Red Junglefowl reservoirs. Molecular Ecology 2015, 24, 2112–2124. DOI: 10.1111/mec.13096.</w:t>
-      </w:r>
-    </w:p>
-    <w:p>
-      <w:pPr>
-        <w:keepLines/>
-        <w:spacing w:after="80" w:line="276" w:lineRule="auto"/>
-        <w:ind w:hanging="400" w:left="400"/>
-        <w:jc w:val="left"/>
-      </w:pPr>
-      <w:r>
-        <w:rPr>
-          <w:sz w:val="20"/>
-        </w:rPr>
-        <w:t>[134]</w:t>
-      </w:r>
-      <w:r>
-        <w:rPr>
-          <w:sz w:val="20"/>
-        </w:rPr>
-        <w:t xml:space="preserve"> Martin Cerezo, M.L.; López, S.; van Dorp, L.; Hellenthal, G.; Johnsson, M.; Gering, E.; Henriksen, R.; Wright, D. Population structure and hybridisation in a population of Hawaiian feral chickens. Heredity 2023, 130, 154–162. DOI: 10.1038/s41437-022-00589-z.</w:t>
-      </w:r>
-    </w:p>
-    <w:p>
-      <w:pPr>
-        <w:keepLines/>
-        <w:spacing w:after="80" w:line="276" w:lineRule="auto"/>
-        <w:ind w:hanging="400" w:left="400"/>
-        <w:jc w:val="left"/>
-      </w:pPr>
-      <w:r>
-        <w:rPr>
-          <w:sz w:val="20"/>
-        </w:rPr>
-        <w:t>[135]</w:t>
-      </w:r>
-      <w:r>
-        <w:rPr>
-          <w:sz w:val="20"/>
-        </w:rPr>
-        <w:t xml:space="preserve"> Johnsson, M.; Gering, E.; Willis, P.; Lopez, S.; Van Dorp, L.; Hellenthal, G.; Henriksen, R.; Friberg, U.; Wright, D. Feralisation targets different genomic loci to domestication in the chicken. Nature Communications 2016, 7, 12950. DOI: 10.1038/ncomms12950.</w:t>
-      </w:r>
-    </w:p>
-    <w:p>
-      <w:pPr>
-        <w:keepLines/>
-        <w:spacing w:after="80" w:line="276" w:lineRule="auto"/>
-        <w:ind w:hanging="400" w:left="400"/>
-        <w:jc w:val="left"/>
-      </w:pPr>
-      <w:r>
-        <w:rPr>
-          <w:sz w:val="20"/>
-        </w:rPr>
-        <w:t>[136]</w:t>
-      </w:r>
-      <w:r>
-        <w:rPr>
-          <w:sz w:val="20"/>
-        </w:rPr>
-        <w:t xml:space="preserve"> Gering, E.; Johnsson, M.; Theunissen, D.; Martin Cerezo, M.L.; Steep, A.; Getty, T.; Henriksen, R.; Wright, D. Signals of selection and ancestry in independently feral </w:t>
-      </w:r>
-      <w:r>
-        <w:rPr>
-          <w:i/>
-          <w:sz w:val="20"/>
-        </w:rPr>
-        <w:t>Gallus gallus</w:t>
-      </w:r>
-      <w:r>
-        <w:rPr>
-          <w:sz w:val="20"/>
-        </w:rPr>
-        <w:t xml:space="preserve"> populations. Molecular Ecology 2024, 33, e17336. DOI: 10.1111/mec.17336.</w:t>
-      </w:r>
-    </w:p>
-    <w:p>
-      <w:pPr>
-        <w:keepLines/>
-        <w:spacing w:after="80" w:line="276" w:lineRule="auto"/>
-        <w:ind w:hanging="400" w:left="400"/>
-        <w:jc w:val="left"/>
-      </w:pPr>
-      <w:r>
-        <w:rPr>
-          <w:sz w:val="20"/>
-        </w:rPr>
-        <w:t>[137]</w:t>
-      </w:r>
-      <w:r>
-        <w:rPr>
-          <w:sz w:val="20"/>
-        </w:rPr>
-        <w:t xml:space="preserve"> Matsuda, Y.; Eda, M.; Ito, S.; Shimmura, T. Genomic origin and consequence of captive red junglefowl in zoological parks. BMC Genomics 2025, 26, 1138. DOI: 10.1186/s12864-025-12366-3.</w:t>
-      </w:r>
-    </w:p>
-    <w:p>
-      <w:pPr>
-        <w:keepLines/>
-        <w:spacing w:after="80" w:line="276" w:lineRule="auto"/>
-        <w:ind w:hanging="400" w:left="400"/>
-        <w:jc w:val="left"/>
-      </w:pPr>
-      <w:r>
-        <w:rPr>
-          <w:sz w:val="20"/>
-        </w:rPr>
-        <w:t>[138]</w:t>
-      </w:r>
-      <w:r>
-        <w:rPr>
-          <w:sz w:val="20"/>
-        </w:rPr>
-        <w:t xml:space="preserve"> Lawson, D.J.; van Dorp, L.; Falush, D. A tutorial on how not to over-interpret STRUCTURE and ADMIXTURE bar plots. Nature Communications 2018, 9, 3258. DOI: 10.1038/s41467-018-05257-7.</w:t>
-      </w:r>
-    </w:p>
-    <w:p>
-      <w:pPr>
-        <w:keepLines/>
-        <w:spacing w:after="80" w:line="276" w:lineRule="auto"/>
-        <w:ind w:hanging="400" w:left="400"/>
-        <w:jc w:val="left"/>
-      </w:pPr>
-      <w:r>
-        <w:rPr>
-          <w:sz w:val="20"/>
-        </w:rPr>
-        <w:t>[139]</w:t>
-      </w:r>
-      <w:r>
-        <w:rPr>
-          <w:sz w:val="20"/>
-        </w:rPr>
-        <w:t xml:space="preserve"> Pourhamidi, S.; Esmailizadeh, A.; Salarmoini, M.; Fozi, M.A. Comparison of productive performance of Marandi, White Leghorn, and Marandi-White Leghorn crossbred chickens. BMC Veterinary Research 2024, 20, 460. DOI: 10.1186/s12917-024-04314-2.</w:t>
-      </w:r>
-    </w:p>
-    <w:p>
-      <w:pPr>
-        <w:keepLines/>
-        <w:spacing w:after="80" w:line="276" w:lineRule="auto"/>
-        <w:ind w:hanging="400" w:left="400"/>
-        <w:jc w:val="left"/>
-      </w:pPr>
-      <w:r>
-        <w:rPr>
-          <w:sz w:val="20"/>
-        </w:rPr>
-        <w:t>[140]</w:t>
-      </w:r>
-      <w:r>
-        <w:rPr>
-          <w:sz w:val="20"/>
-        </w:rPr>
-        <w:t xml:space="preserve"> Martínez-Martínez, L.; Vallecillos, A.; Orengo, J.; Escobar, S.; Schiavone, A.; Armero, E. Crossbreeding a Mediterranean Local Chicken Breed with a Medium-Growing Commercial Hybrid as a Complementary Strategy for Conservation and Productive Valorization: Growth Performance, Carcass Traits, and Meat Quality. Animals 2026, 16, 2541. DOI: 10.3390/ani16162541.</w:t>
-      </w:r>
-    </w:p>
-    <w:p>
-      <w:pPr>
-        <w:keepLines/>
-        <w:spacing w:after="80" w:line="276" w:lineRule="auto"/>
-        <w:ind w:hanging="400" w:left="400"/>
-        <w:jc w:val="left"/>
-      </w:pPr>
-      <w:r>
-        <w:rPr>
-          <w:sz w:val="20"/>
-        </w:rPr>
-        <w:t>[141]</w:t>
-      </w:r>
-      <w:r>
-        <w:rPr>
-          <w:sz w:val="20"/>
-        </w:rPr>
-        <w:t xml:space="preserve"> Kong, Y.; Wen, Z.; Cai, X.; Tan, L.; Liu, Z.; Wang, Q.; Li, Q.; Yang, N.; Wang, Y.; Zhao, Y. Genetic traceability, conservation effectiveness, and selection signatures analysis based on ancestral information: a case study of Beijing-You chicken. BMC Genomics 2025, 26, 402. DOI: 10.1186/s12864-025-11563-4.</w:t>
+        <w:t xml:space="preserve"> Cai, Z.F.; Liu, B.; Yin, T.T.; Ma, C.; Han, Z.T.; Gu, L.H.; Zhang, C.; Wu, F.; Liu, L.S.; Shi, X.; et al. Harnessing Deep Learning in Searching Wild Relatives of Domestic Animals. Molecular Ecology Resources 2026, 26, e70133. DOI: 10.1111/1755-0998.70133.</w:t>
       </w:r>
     </w:p>
     <w:sectPr>

</xml_diff>